<commit_message>
Fix abstract acceptance letter rendering and layout
Update abstract acceptance DOCX templates to keep the committee header centered, render the abstract title in its own indented left-aligned paragraph, and keep the closing quote plus “for presentation at the conference.” attached to the title flow.

Title-case the first Poster presentation label in the poster template while preserving the existing Oral wording.

Sanitize DOCX template data before rendering so XML-invalid control characters in abstract titles do not crash docxtemplater/PDF generation, and normalize abstract title whitespace.

Rebuild the oral and poster abstract acceptance letter templates with the updated layout.
</commit_message>
<xml_diff>
--- a/src/templates/accp-abstract-accept-oral-template.docx
+++ b/src/templates/accp-abstract-accept-oral-template.docx
@@ -19,8 +19,8 @@
         <w:drawing>
           <wp:anchor allowOverlap="1" behindDoc="0" distB="0" distT="0" distL="114300" distR="114300" hidden="0" layoutInCell="1" locked="0" relativeHeight="0" simplePos="0">
             <wp:simplePos x="0" y="0"/>
-            <wp:positionH relativeFrom="column">
-              <wp:posOffset>-298449</wp:posOffset>
+            <wp:positionH relativeFrom="page">
+              <wp:align>center</wp:align>
             </wp:positionH>
             <wp:positionV relativeFrom="paragraph">
               <wp:posOffset>-742949</wp:posOffset>
@@ -327,7 +327,28 @@
           <w:szCs w:val="24"/>
           <w:rtl w:val="0"/>
         </w:rPr>
-        <w:t xml:space="preserve">titled "</w:t>
+        <w:t xml:space="preserve">titled</w:t>
+      </w:r>
+    </w:p>
+    <w:p>
+      <w:pPr>
+        <w:spacing w:after="0" w:before="0" w:line="240" w:lineRule="auto"/>
+        <w:ind w:firstLine="720"/>
+        <w:jc w:val="left"/>
+        <w:rPr>
+          <w:rFonts w:ascii="Times New Roman" w:cs="Times New Roman" w:eastAsia="Times New Roman" w:hAnsi="Times New Roman"/>
+          <w:sz w:val="24"/>
+          <w:szCs w:val="24"/>
+        </w:rPr>
+      </w:pPr>
+      <w:r>
+        <w:rPr>
+          <w:rFonts w:ascii="Times New Roman" w:cs="Times New Roman" w:eastAsia="Times New Roman" w:hAnsi="Times New Roman"/>
+          <w:sz w:val="24"/>
+          <w:szCs w:val="24"/>
+          <w:rtl w:val="0"/>
+        </w:rPr>
+        <w:t xml:space="preserve">"</w:t>
       </w:r>
       <w:r>
         <w:rPr>

</xml_diff>